<commit_message>
Updated resumes and CV with new design elements
</commit_message>
<xml_diff>
--- a/OscarCalles-Resume-2026.docx
+++ b/OscarCalles-Resume-2026.docx
@@ -5,29 +5,24 @@
     <w:p>
       <w:r>
         <w:rPr>
-          <w:rFonts w:ascii="Calibri" w:hAnsi="Calibri"/>
           <w:b/>
-          <w:sz w:val="40"/>
+          <w:sz w:val="36"/>
         </w:rPr>
         <w:t>Óscar Calles Sáez</w:t>
       </w:r>
     </w:p>
     <w:p>
-      <w:pPr/>
       <w:r>
         <w:t>Rodrigo de la Fuente 58 • Toledo, Spain • 45005 | (+34) 617 02 69 41 | ocalles@gmail.com | linkedin.com/in/oscar-calles</w:t>
       </w:r>
     </w:p>
+    <w:p/>
     <w:p>
       <w:r>
         <w:rPr>
           <w:b/>
-          <w:sz w:val="26"/>
         </w:rPr>
         <w:t>Bio</w:t>
-      </w:r>
-      <w:r>
-        <w:br/>
       </w:r>
     </w:p>
     <w:p>
@@ -35,40 +30,45 @@
         <w:t>Highly driven Software Engineer with over 15 years of experience in full-stack development, backend systems, and mobile applications. Proven track record of improving software performance, modernizing legacy systems, and delivering complex projects on time. Strong advocate of clean code, architectural design, and continuous integration. Recently focused on Spring Boot microservices and Angular SPAs, combining AI-assisted development with human-led architectural decisions to accelerate delivery without sacrificing quality.</w:t>
       </w:r>
     </w:p>
+    <w:p/>
     <w:p>
       <w:r>
         <w:rPr>
           <w:b/>
-          <w:sz w:val="26"/>
         </w:rPr>
         <w:t>Skills</w:t>
       </w:r>
     </w:p>
     <w:p>
       <w:r>
-        <w:t>Languages: C#, Java, Python, JavaScript, TypeScript, Objective-C</w:t>
+        <w:t>Languages: Java, TypeScript, JavaScript, C#, Python (learning/fast adoption)</w:t>
       </w:r>
     </w:p>
     <w:p>
       <w:r>
-        <w:t>Frameworks: .NET Core, Spring Boot, Spring MVC, Angular 17, WPF, Entity Framework, LINQ, J2SE, J2EE</w:t>
+        <w:t>Frameworks: Spring Boot, Angular 17, .NET Core</w:t>
       </w:r>
     </w:p>
     <w:p>
       <w:r>
-        <w:t>Tools: Git, Kanban, Agile, Docker, Microservices, REST APIs, OAuth2, OpenID, Azure, GCP, Terraform, CI/CD</w:t>
+        <w:t>Cloud &amp; Infra: GCP (certified), Terraform, Docker, Azure, CI/CD (Azure DevOps, GitHub Actions)</w:t>
       </w:r>
     </w:p>
     <w:p>
       <w:r>
-        <w:t>AI-Assisted Dev: GitHub Copilot Pro, agentic coding workflows, automated commit messaging, documentation-as-code (docs.md), architectural review &amp; validation</w:t>
+        <w:t>AI/Agentic: GitHub Copilot Pro, agentic workflows, MCP (Model Context Protocol), AI-assisted code review, automated commit messaging, Cline integration</w:t>
       </w:r>
     </w:p>
     <w:p>
       <w:r>
+        <w:t>Security: OAuth2, OpenID, JWT, Spring Security</w:t>
+      </w:r>
+    </w:p>
+    <w:p/>
+    <w:p>
+      <w:r>
         <w:rPr>
           <w:b/>
-          <w:sz w:val="26"/>
         </w:rPr>
         <w:t>Education</w:t>
       </w:r>
@@ -81,11 +81,11 @@
         <w:t xml:space="preserve"> – Universidad Nacional de Educación a Distancia (UNED), Graduated 2007</w:t>
       </w:r>
     </w:p>
+    <w:p/>
     <w:p>
       <w:r>
         <w:rPr>
           <w:b/>
-          <w:sz w:val="26"/>
         </w:rPr>
         <w:t>Experience</w:t>
       </w:r>
@@ -114,65 +114,41 @@
       </w:r>
     </w:p>
     <w:p>
-      <w:pPr>
-        <w:pStyle w:val="ListBullet"/>
-      </w:pPr>
       <w:r>
         <w:t>Leading development of a new enterprise-grade digital services platform using Java 11, Spring Boot, and Angular 17.</w:t>
       </w:r>
     </w:p>
     <w:p>
-      <w:pPr>
-        <w:pStyle w:val="ListBullet"/>
-      </w:pPr>
       <w:r>
         <w:t>Designed and implemented RESTful microservices with Spring Data JPA, Spring Security, and OAuth2 authentication.</w:t>
       </w:r>
     </w:p>
     <w:p>
-      <w:pPr>
-        <w:pStyle w:val="ListBullet"/>
-      </w:pPr>
       <w:r>
         <w:t>Built responsive, component-based frontends with Angular 17, using RxJS, reactive forms, and NgRx for state management.</w:t>
       </w:r>
     </w:p>
     <w:p>
-      <w:pPr>
-        <w:pStyle w:val="ListBullet"/>
-      </w:pPr>
       <w:r>
         <w:t>Integrated GitHub Copilot Pro to accelerate coding, generating descriptive commit messages and maintaining a docs.md file with every architectural change.</w:t>
       </w:r>
     </w:p>
     <w:p>
-      <w:pPr>
-        <w:pStyle w:val="ListBullet"/>
-      </w:pPr>
       <w:r>
         <w:t>Extended AI capabilities by designing a Docker-based MCP gateway that centralizes GitHub, SonarQube, SQL, Keycloak, and browser automation tools into a unified local endpoint layer, enabling Cline and similar agents to invoke specialized services without exposing credentials.</w:t>
       </w:r>
     </w:p>
     <w:p>
-      <w:pPr>
-        <w:pStyle w:val="ListBullet"/>
-      </w:pPr>
       <w:r>
         <w:t>Evolved the development process to an agentic mode, where the AI agent proposes code implementations and architectural variations, while I review, validate, and select the best approach based on performance, maintainability, and team style guidelines.</w:t>
       </w:r>
     </w:p>
     <w:p>
-      <w:pPr>
-        <w:pStyle w:val="ListBullet"/>
-      </w:pPr>
       <w:r>
         <w:t>Reduced feature delivery time by ~30% compared to traditional coding, while keeping technical debt under control through continuous validation and manual oversight.</w:t>
       </w:r>
     </w:p>
     <w:p>
-      <w:pPr>
-        <w:pStyle w:val="ListBullet"/>
-      </w:pPr>
       <w:r>
         <w:t>Collaborated with product owners and QA to align deliverables with business requirements and non-functional goals (scalability, security, observability).</w:t>
       </w:r>
@@ -180,414 +156,6 @@
     <w:p>
       <w:r>
         <w:t>Java 11 • Spring Boot • Angular 17 • OAuth2 • RxJS • NgRx • Docker • GCP</w:t>
-      </w:r>
-    </w:p>
-    <w:p>
-      <w:r>
-        <w:rPr>
-          <w:b/>
-        </w:rPr>
-        <w:t>.NET Software Developer, Full Stack</w:t>
-      </w:r>
-      <w:r>
-        <w:t xml:space="preserve">  </w:t>
-      </w:r>
-      <w:r>
-        <w:rPr>
-          <w:b/>
-        </w:rPr>
-        <w:t>Accuro Spain</w:t>
-      </w:r>
-      <w:r>
-        <w:t xml:space="preserve">  </w:t>
-      </w:r>
-      <w:r>
-        <w:t>06/2023 – 04/2025</w:t>
-      </w:r>
-    </w:p>
-    <w:p>
-      <w:pPr>
-        <w:pStyle w:val="ListBullet"/>
-      </w:pPr>
-      <w:r>
-        <w:t>Public sector government migration project using .NET 7 and Angular 15.</w:t>
-      </w:r>
-    </w:p>
-    <w:p>
-      <w:pPr>
-        <w:pStyle w:val="ListBullet"/>
-      </w:pPr>
-      <w:r>
-        <w:t>Modernized legacy modules, refactored business logic, and implemented new micro-frontends.</w:t>
-      </w:r>
-    </w:p>
-    <w:p>
-      <w:pPr>
-        <w:pStyle w:val="ListBullet"/>
-      </w:pPr>
-      <w:r>
-        <w:t>Improved test coverage with xUnit and Moq, and ensured CI/CD pipelines with Azure DevOps.</w:t>
-      </w:r>
-    </w:p>
-    <w:p>
-      <w:r>
-        <w:rPr>
-          <w:b/>
-        </w:rPr>
-        <w:t>.NET Software Developer, Full Stack</w:t>
-      </w:r>
-      <w:r>
-        <w:t xml:space="preserve">  </w:t>
-      </w:r>
-      <w:r>
-        <w:rPr>
-          <w:b/>
-        </w:rPr>
-        <w:t>UST Spain</w:t>
-      </w:r>
-      <w:r>
-        <w:t xml:space="preserve">  </w:t>
-      </w:r>
-      <w:r>
-        <w:t>12/2021 – 04/2023</w:t>
-      </w:r>
-    </w:p>
-    <w:p>
-      <w:pPr>
-        <w:pStyle w:val="ListBullet"/>
-      </w:pPr>
-      <w:r>
-        <w:t>VMware migration project using .NET and Angular (12/2021 – 07/2022).</w:t>
-      </w:r>
-    </w:p>
-    <w:p>
-      <w:pPr>
-        <w:pStyle w:val="ListBullet"/>
-      </w:pPr>
-      <w:r>
-        <w:t>Developed backend APIs and integrated with external authentication systems.</w:t>
-      </w:r>
-    </w:p>
-    <w:p>
-      <w:r>
-        <w:t>.NET • Angular • REST APIs • OAuth2</w:t>
-      </w:r>
-    </w:p>
-    <w:p>
-      <w:r>
-        <w:rPr>
-          <w:b/>
-        </w:rPr>
-        <w:t>.NET Software Developer</w:t>
-      </w:r>
-      <w:r>
-        <w:t xml:space="preserve">  </w:t>
-      </w:r>
-      <w:r>
-        <w:rPr>
-          <w:b/>
-        </w:rPr>
-        <w:t>Castilla-La Mancha Media</w:t>
-      </w:r>
-      <w:r>
-        <w:t xml:space="preserve">  </w:t>
-      </w:r>
-      <w:r>
-        <w:t>12/2015 – 11/2021</w:t>
-      </w:r>
-    </w:p>
-    <w:p>
-      <w:pPr>
-        <w:pStyle w:val="ListBullet"/>
-      </w:pPr>
-      <w:r>
-        <w:t>Built internal tools using WPF, .NET, console applications, Windows scripting, JavaScript, and Python.</w:t>
-      </w:r>
-    </w:p>
-    <w:p>
-      <w:pPr>
-        <w:pStyle w:val="ListBullet"/>
-      </w:pPr>
-      <w:r>
-        <w:t>Maintained and improved legacy systems, reducing response times by 20%.</w:t>
-      </w:r>
-    </w:p>
-    <w:p>
-      <w:r>
-        <w:t>WPF • .NET • JavaScript • Python</w:t>
-      </w:r>
-    </w:p>
-    <w:p>
-      <w:r>
-        <w:rPr>
-          <w:b/>
-        </w:rPr>
-        <w:t>iOS Developer</w:t>
-      </w:r>
-      <w:r>
-        <w:t xml:space="preserve">  </w:t>
-      </w:r>
-      <w:r>
-        <w:rPr>
-          <w:b/>
-        </w:rPr>
-        <w:t>Gwella</w:t>
-      </w:r>
-      <w:r>
-        <w:t xml:space="preserve">  </w:t>
-      </w:r>
-      <w:r>
-        <w:t>10/2015 – 12/2015</w:t>
-      </w:r>
-    </w:p>
-    <w:p>
-      <w:pPr>
-        <w:pStyle w:val="ListBullet"/>
-      </w:pPr>
-      <w:r>
-        <w:t>Developed a health-sector iOS application with Objective-C and REST APIs.</w:t>
-      </w:r>
-    </w:p>
-    <w:p>
-      <w:r>
-        <w:t>iOS • Objective-C • REST</w:t>
-      </w:r>
-    </w:p>
-    <w:p>
-      <w:r>
-        <w:rPr>
-          <w:b/>
-        </w:rPr>
-        <w:t>iOS Developer</w:t>
-      </w:r>
-      <w:r>
-        <w:t xml:space="preserve">  </w:t>
-      </w:r>
-      <w:r>
-        <w:rPr>
-          <w:b/>
-        </w:rPr>
-        <w:t>Buzinger</w:t>
-      </w:r>
-      <w:r>
-        <w:t xml:space="preserve">  </w:t>
-      </w:r>
-      <w:r>
-        <w:t>03/2015 – 09/2015</w:t>
-      </w:r>
-    </w:p>
-    <w:p>
-      <w:pPr>
-        <w:pStyle w:val="ListBullet"/>
-      </w:pPr>
-      <w:r>
-        <w:t>Created an indoor beacon-location iOS app.</w:t>
-      </w:r>
-    </w:p>
-    <w:p>
-      <w:pPr>
-        <w:pStyle w:val="ListBullet"/>
-      </w:pPr>
-      <w:r>
-        <w:t>Also contributed to J2EE, SQL, Angular, and Spring MVC projects.</w:t>
-      </w:r>
-    </w:p>
-    <w:p>
-      <w:r>
-        <w:t>iOS • Objective-C • J2EE • SQL • Angular • Spring MVC</w:t>
-      </w:r>
-    </w:p>
-    <w:p>
-      <w:r>
-        <w:rPr>
-          <w:b/>
-          <w:sz w:val="26"/>
-        </w:rPr>
-        <w:t>Courses &amp; Certifications (2022–2023)</w:t>
-      </w:r>
-    </w:p>
-    <w:p>
-      <w:r>
-        <w:rPr>
-          <w:b/>
-        </w:rPr>
-        <w:t>Udemy</w:t>
-      </w:r>
-    </w:p>
-    <w:p>
-      <w:pPr>
-        <w:pStyle w:val="ListBullet"/>
-      </w:pPr>
-      <w:r>
-        <w:t>Agile Fundamentals (Scrum &amp; Kanban)</w:t>
-      </w:r>
-    </w:p>
-    <w:p>
-      <w:pPr>
-        <w:pStyle w:val="ListBullet"/>
-      </w:pPr>
-      <w:r>
-        <w:t>Blazor Bootcamp – .NET 6 E-Commerce (WASM &amp; Server)</w:t>
-      </w:r>
-    </w:p>
-    <w:p>
-      <w:pPr>
-        <w:pStyle w:val="ListBullet"/>
-      </w:pPr>
-      <w:r>
-        <w:t>ASP.NET Core + Angular from Scratch</w:t>
-      </w:r>
-    </w:p>
-    <w:p>
-      <w:pPr>
-        <w:pStyle w:val="ListBullet"/>
-      </w:pPr>
-      <w:r>
-        <w:t>Building Microservices with ASP.NET Core 5.0 and Docker</w:t>
-      </w:r>
-    </w:p>
-    <w:p>
-      <w:pPr>
-        <w:pStyle w:val="ListBullet"/>
-      </w:pPr>
-      <w:r>
-        <w:t>Git Mindset – Underlying Architecture</w:t>
-      </w:r>
-    </w:p>
-    <w:p>
-      <w:pPr>
-        <w:pStyle w:val="ListBullet"/>
-      </w:pPr>
-      <w:r>
-        <w:t>Google Cloud Developer – GCP Professional Certification</w:t>
-      </w:r>
-    </w:p>
-    <w:p>
-      <w:pPr>
-        <w:pStyle w:val="ListBullet"/>
-      </w:pPr>
-      <w:r>
-        <w:t>Microservices Architecture – Complete Guide, Implementation on .NET 5, Designing Highly Scalable Systems, Observability &amp; Resilience</w:t>
-      </w:r>
-    </w:p>
-    <w:p>
-      <w:pPr>
-        <w:pStyle w:val="ListBullet"/>
-      </w:pPr>
-      <w:r>
-        <w:t>Secure .NET Microservices with IdentityServer4, OAuth2, OpenID</w:t>
-      </w:r>
-    </w:p>
-    <w:p>
-      <w:pPr>
-        <w:pStyle w:val="ListBullet"/>
-      </w:pPr>
-      <w:r>
-        <w:t>SQL for Beginners (MySQL &amp; Database Design)</w:t>
-      </w:r>
-    </w:p>
-    <w:p>
-      <w:pPr>
-        <w:pStyle w:val="ListBullet"/>
-      </w:pPr>
-      <w:r>
-        <w:t>Terraform Beginner to Advanced (GCP)</w:t>
-      </w:r>
-    </w:p>
-    <w:p>
-      <w:pPr>
-        <w:pStyle w:val="ListBullet"/>
-      </w:pPr>
-      <w:r>
-        <w:t>The Complete Node.js Developer Course (3rd Edition)</w:t>
-      </w:r>
-    </w:p>
-    <w:p>
-      <w:pPr>
-        <w:pStyle w:val="ListBullet"/>
-      </w:pPr>
-      <w:r>
-        <w:t>English Grammar Launch</w:t>
-      </w:r>
-    </w:p>
-    <w:p>
-      <w:pPr>
-        <w:pStyle w:val="ListBullet"/>
-      </w:pPr>
-      <w:r>
-        <w:t>Arquitectura de Aplicaciones Empresariales con .NET 7</w:t>
-      </w:r>
-    </w:p>
-    <w:p>
-      <w:r>
-        <w:rPr>
-          <w:b/>
-        </w:rPr>
-        <w:t>Pluralsight</w:t>
-      </w:r>
-    </w:p>
-    <w:p>
-      <w:pPr>
-        <w:pStyle w:val="ListBullet"/>
-      </w:pPr>
-      <w:r>
-        <w:t>Object-Oriented Programming Fundamentals in C#</w:t>
-      </w:r>
-    </w:p>
-    <w:p>
-      <w:pPr>
-        <w:pStyle w:val="ListBullet"/>
-      </w:pPr>
-      <w:r>
-        <w:t>Developing with .NET on Azure – Getting Started</w:t>
-      </w:r>
-    </w:p>
-    <w:p>
-      <w:pPr>
-        <w:pStyle w:val="ListBullet"/>
-      </w:pPr>
-      <w:r>
-        <w:t>.NET 6 First Look</w:t>
-      </w:r>
-    </w:p>
-    <w:p>
-      <w:pPr>
-        <w:pStyle w:val="ListBullet"/>
-      </w:pPr>
-      <w:r>
-        <w:t>Regular Expressions</w:t>
-      </w:r>
-    </w:p>
-    <w:p>
-      <w:pPr>
-        <w:pStyle w:val="ListBullet"/>
-      </w:pPr>
-      <w:r>
-        <w:t>Cross-platform SQL Server Management for Developers (VS Code)</w:t>
-      </w:r>
-    </w:p>
-    <w:p>
-      <w:pPr>
-        <w:pStyle w:val="ListBullet"/>
-      </w:pPr>
-      <w:r>
-        <w:t>Using IIS 10 as a Developer</w:t>
-      </w:r>
-    </w:p>
-    <w:p>
-      <w:pPr>
-        <w:pStyle w:val="ListBullet"/>
-      </w:pPr>
-      <w:r>
-        <w:t>Angular 11 Fundamentals, Getting Started, NgRx, Reactive Forms, Routing, Component Communication, RxJS, Unit Testing (Angular 12)</w:t>
-      </w:r>
-    </w:p>
-    <w:p>
-      <w:pPr>
-        <w:pStyle w:val="ListBullet"/>
-      </w:pPr>
-      <w:r>
-        <w:t>Mocking with Moq and xUnit</w:t>
       </w:r>
     </w:p>
     <w:sectPr>
@@ -963,12 +531,9 @@
     <w:name w:val="Normal"/>
     <w:qFormat/>
     <w:rsid w:val="00FC693F"/>
-    <w:pPr>
-      <w:spacing w:after="80"/>
-    </w:pPr>
     <w:rPr>
       <w:rFonts w:ascii="Calibri" w:hAnsi="Calibri"/>
-      <w:sz w:val="21"/>
+      <w:sz w:val="22"/>
     </w:rPr>
   </w:style>
   <w:style w:type="paragraph" w:styleId="Header">

</xml_diff>